<commit_message>
reverted to old project, took out phone #
</commit_message>
<xml_diff>
--- a/assets/files/Christopher Lewis ASCTE Resume.docx
+++ b/assets/files/Christopher Lewis ASCTE Resume.docx
@@ -165,13 +165,6 @@
                 <w:color w:val="002868"/>
               </w:rPr>
             </w:pPr>
-            <w:r>
-              <w:rPr>
-                <w:rFonts w:ascii="Roboto" w:eastAsia="Roboto" w:hAnsi="Roboto" w:cs="Roboto"/>
-                <w:color w:val="002868"/>
-              </w:rPr>
-              <w:t>(256) 468-0674</w:t>
-            </w:r>
           </w:p>
         </w:tc>
         <w:tc>
@@ -504,7 +497,6 @@
                 <w:szCs w:val="24"/>
               </w:rPr>
             </w:pPr>
-            <w:proofErr w:type="gramStart"/>
             <w:r>
               <w:rPr>
                 <w:rFonts w:ascii="Roboto" w:eastAsia="Roboto" w:hAnsi="Roboto" w:cs="Roboto"/>
@@ -512,17 +504,7 @@
                 <w:color w:val="002868"/>
                 <w:highlight w:val="white"/>
               </w:rPr>
-              <w:t>Junior</w:t>
-            </w:r>
-            <w:proofErr w:type="gramEnd"/>
-            <w:r>
-              <w:rPr>
-                <w:rFonts w:ascii="Roboto" w:eastAsia="Roboto" w:hAnsi="Roboto" w:cs="Roboto"/>
-                <w:iCs/>
-                <w:color w:val="002868"/>
-                <w:highlight w:val="white"/>
-              </w:rPr>
-              <w:t xml:space="preserve"> attending the nation’s only high school focused on integrating cyber technology and engineering into all academic disciplines. Enjoy working on software projects and applying technical and problem-solving skills in collaborative environments.</w:t>
+              <w:t>Junior attending the nation’s only high school focused on integrating cyber technology and engineering into all academic disciplines. Enjoy working on software projects and applying technical and problem-solving skills in collaborative environments.</w:t>
             </w:r>
           </w:p>
         </w:tc>
@@ -2654,23 +2636,7 @@
                 <w:rFonts w:ascii="Roboto" w:eastAsia="Roboto" w:hAnsi="Roboto" w:cs="Roboto"/>
                 <w:color w:val="002868"/>
               </w:rPr>
-              <w:t xml:space="preserve">Customer Service Clerk </w:t>
-            </w:r>
-            <w:proofErr w:type="gramStart"/>
-            <w:r>
-              <w:rPr>
-                <w:rFonts w:ascii="Roboto" w:eastAsia="Roboto" w:hAnsi="Roboto" w:cs="Roboto"/>
-                <w:color w:val="002868"/>
-              </w:rPr>
-              <w:t>•  Publix</w:t>
-            </w:r>
-            <w:proofErr w:type="gramEnd"/>
-            <w:r>
-              <w:rPr>
-                <w:rFonts w:ascii="Roboto" w:eastAsia="Roboto" w:hAnsi="Roboto" w:cs="Roboto"/>
-                <w:color w:val="002868"/>
-              </w:rPr>
-              <w:t xml:space="preserve"> - </w:t>
+              <w:t xml:space="preserve">Customer Service Clerk •  Publix - </w:t>
             </w:r>
             <w:r>
               <w:rPr>
@@ -2784,29 +2750,7 @@
                 <w:szCs w:val="20"/>
                 <w:lang w:val="en-US"/>
               </w:rPr>
-              <w:t xml:space="preserve">Assisted customers </w:t>
-            </w:r>
-            <w:proofErr w:type="gramStart"/>
-            <w:r>
-              <w:rPr>
-                <w:rFonts w:ascii="Roboto" w:eastAsia="Roboto" w:hAnsi="Roboto" w:cs="Roboto"/>
-                <w:color w:val="002868"/>
-                <w:sz w:val="20"/>
-                <w:szCs w:val="20"/>
-                <w:lang w:val="en-US"/>
-              </w:rPr>
-              <w:t>to</w:t>
-            </w:r>
-            <w:proofErr w:type="gramEnd"/>
-            <w:r>
-              <w:rPr>
-                <w:rFonts w:ascii="Roboto" w:eastAsia="Roboto" w:hAnsi="Roboto" w:cs="Roboto"/>
-                <w:color w:val="002868"/>
-                <w:sz w:val="20"/>
-                <w:szCs w:val="20"/>
-                <w:lang w:val="en-US"/>
-              </w:rPr>
-              <w:t xml:space="preserve"> their vehicles, providing courteous service and support for individuals with mobility needs.</w:t>
+              <w:t>Assisted customers to their vehicles, providing courteous service and support for individuals with mobility needs.</w:t>
             </w:r>
           </w:p>
           <w:p>
@@ -2851,23 +2795,7 @@
                 <w:rFonts w:ascii="Roboto" w:eastAsia="Roboto" w:hAnsi="Roboto" w:cs="Roboto"/>
                 <w:color w:val="002868"/>
               </w:rPr>
-              <w:t xml:space="preserve">Cashier </w:t>
-            </w:r>
-            <w:proofErr w:type="gramStart"/>
-            <w:r>
-              <w:rPr>
-                <w:rFonts w:ascii="Roboto" w:eastAsia="Roboto" w:hAnsi="Roboto" w:cs="Roboto"/>
-                <w:color w:val="002868"/>
-              </w:rPr>
-              <w:t>•  Publix</w:t>
-            </w:r>
-            <w:proofErr w:type="gramEnd"/>
-            <w:r>
-              <w:rPr>
-                <w:rFonts w:ascii="Roboto" w:eastAsia="Roboto" w:hAnsi="Roboto" w:cs="Roboto"/>
-                <w:color w:val="002868"/>
-              </w:rPr>
-              <w:t xml:space="preserve"> - </w:t>
+              <w:t xml:space="preserve">Cashier •  Publix - </w:t>
             </w:r>
             <w:r>
               <w:rPr>
@@ -6329,23 +6257,6 @@
 </file>
 
 <file path=customXml/item1.xml><?xml version="1.0" encoding="utf-8"?>
-<p:properties xmlns:p="http://schemas.microsoft.com/office/2006/metadata/properties" xmlns:xsi="http://www.w3.org/2001/XMLSchema-instance" xmlns:pc="http://schemas.microsoft.com/office/infopath/2007/PartnerControls">
-  <documentManagement>
-    <_activity xmlns="c4bc36a6-fba7-48d0-b2e2-47334fc256b6" xsi:nil="true"/>
-  </documentManagement>
-</p:properties>
-</file>
-
-<file path=customXml/item2.xml><?xml version="1.0" encoding="utf-8"?>
-<?mso-contentType ?>
-<FormTemplates xmlns="http://schemas.microsoft.com/sharepoint/v3/contenttype/forms">
-  <Display>DocumentLibraryForm</Display>
-  <Edit>DocumentLibraryForm</Edit>
-  <New>DocumentLibraryForm</New>
-</FormTemplates>
-</file>
-
-<file path=customXml/item3.xml><?xml version="1.0" encoding="utf-8"?>
 <ct:contentTypeSchema xmlns:ct="http://schemas.microsoft.com/office/2006/metadata/contentType" xmlns:ma="http://schemas.microsoft.com/office/2006/metadata/properties/metaAttributes" ct:_="" ma:_="" ma:contentTypeName="Document" ma:contentTypeID="0x0101009E0898A40F5B57469CAEB399B6973567" ma:contentTypeVersion="14" ma:contentTypeDescription="Create a new document." ma:contentTypeScope="" ma:versionID="69522652f0aa6b6b7a61f6e4d14951fc">
   <xsd:schema xmlns:xsd="http://www.w3.org/2001/XMLSchema" xmlns:xs="http://www.w3.org/2001/XMLSchema" xmlns:p="http://schemas.microsoft.com/office/2006/metadata/properties" xmlns:ns3="c4bc36a6-fba7-48d0-b2e2-47334fc256b6" xmlns:ns4="ef6902ed-11cf-4c1d-84aa-b3bf88acca6f" targetNamespace="http://schemas.microsoft.com/office/2006/metadata/properties" ma:root="true" ma:fieldsID="e6d30f3516dcb206a109fe1160438cce" ns3:_="" ns4:_="">
     <xsd:import namespace="c4bc36a6-fba7-48d0-b2e2-47334fc256b6"/>
@@ -6572,25 +6483,24 @@
 </ct:contentTypeSchema>
 </file>
 
-<file path=customXml/itemProps1.xml><?xml version="1.0" encoding="utf-8"?>
-<ds:datastoreItem xmlns:ds="http://schemas.openxmlformats.org/officeDocument/2006/customXml" ds:itemID="{E8069FA8-C9BA-466D-8AD2-E6CA8B887BFE}">
-  <ds:schemaRefs>
-    <ds:schemaRef ds:uri="http://schemas.microsoft.com/office/2006/metadata/properties"/>
-    <ds:schemaRef ds:uri="http://schemas.microsoft.com/office/infopath/2007/PartnerControls"/>
-    <ds:schemaRef ds:uri="c4bc36a6-fba7-48d0-b2e2-47334fc256b6"/>
-  </ds:schemaRefs>
-</ds:datastoreItem>
+<file path=customXml/item2.xml><?xml version="1.0" encoding="utf-8"?>
+<?mso-contentType ?>
+<FormTemplates xmlns="http://schemas.microsoft.com/sharepoint/v3/contenttype/forms">
+  <Display>DocumentLibraryForm</Display>
+  <Edit>DocumentLibraryForm</Edit>
+  <New>DocumentLibraryForm</New>
+</FormTemplates>
 </file>
 
-<file path=customXml/itemProps2.xml><?xml version="1.0" encoding="utf-8"?>
-<ds:datastoreItem xmlns:ds="http://schemas.openxmlformats.org/officeDocument/2006/customXml" ds:itemID="{EE4431E8-19AE-4B26-94BA-A1C35685C888}">
-  <ds:schemaRefs>
-    <ds:schemaRef ds:uri="http://schemas.microsoft.com/sharepoint/v3/contenttype/forms"/>
-  </ds:schemaRefs>
-</ds:datastoreItem>
+<file path=customXml/item3.xml><?xml version="1.0" encoding="utf-8"?>
+<p:properties xmlns:p="http://schemas.microsoft.com/office/2006/metadata/properties" xmlns:xsi="http://www.w3.org/2001/XMLSchema-instance" xmlns:pc="http://schemas.microsoft.com/office/infopath/2007/PartnerControls">
+  <documentManagement>
+    <_activity xmlns="c4bc36a6-fba7-48d0-b2e2-47334fc256b6" xsi:nil="true"/>
+  </documentManagement>
+</p:properties>
 </file>
 
-<file path=customXml/itemProps3.xml><?xml version="1.0" encoding="utf-8"?>
+<file path=customXml/itemProps1.xml><?xml version="1.0" encoding="utf-8"?>
 <ds:datastoreItem xmlns:ds="http://schemas.openxmlformats.org/officeDocument/2006/customXml" ds:itemID="{000B1285-43D4-4A89-B5E1-AD9AD73A2606}">
   <ds:schemaRefs>
     <ds:schemaRef ds:uri="http://schemas.microsoft.com/office/2006/metadata/contentType"/>
@@ -6607,4 +6517,22 @@
     <ds:schemaRef ds:uri="http://schemas.microsoft.com/internal/obd"/>
   </ds:schemaRefs>
 </ds:datastoreItem>
+</file>
+
+<file path=customXml/itemProps2.xml><?xml version="1.0" encoding="utf-8"?>
+<ds:datastoreItem xmlns:ds="http://schemas.openxmlformats.org/officeDocument/2006/customXml" ds:itemID="{EE4431E8-19AE-4B26-94BA-A1C35685C888}">
+  <ds:schemaRefs>
+    <ds:schemaRef ds:uri="http://schemas.microsoft.com/sharepoint/v3/contenttype/forms"/>
+  </ds:schemaRefs>
+</ds:datastoreItem>
+</file>
+
+<file path=customXml/itemProps3.xml><?xml version="1.0" encoding="utf-8"?>
+<ds:datastoreItem xmlns:ds="http://schemas.openxmlformats.org/officeDocument/2006/customXml" ds:itemID="{E8069FA8-C9BA-466D-8AD2-E6CA8B887BFE}">
+  <ds:schemaRefs>
+    <ds:schemaRef ds:uri="http://schemas.microsoft.com/office/2006/metadata/properties"/>
+    <ds:schemaRef ds:uri="http://schemas.microsoft.com/office/infopath/2007/PartnerControls"/>
+    <ds:schemaRef ds:uri="c4bc36a6-fba7-48d0-b2e2-47334fc256b6"/>
+  </ds:schemaRefs>
+</ds:datastoreItem>
 </file>
</xml_diff>